<commit_message>
Chapter 5: Apply paragraph breaks and word changes from Word doc edits
</commit_message>
<xml_diff>
--- a/manuscript/COMPLETE-MANUSCRIPT-FOR-REVIEW.docx
+++ b/manuscript/COMPLETE-MANUSCRIPT-FOR-REVIEW.docx
@@ -10077,7 +10077,31 @@
         <w:t xml:space="preserve"> </w:t>
       </w:r>
       <w:r>
-        <w:t xml:space="preserve">nails. The ones that replace the hours she would otherwise have spent scratching out survival directly from the land. If she doesn’t sell enough nails to cover necessities, she stops functioning. She can’t make more nails if she’s starving. She can’t trade if she can’t get to market. This pile is non-negotiable. It’s the floor.</w:t>
+        <w:t xml:space="preserve">nails.</w:t>
+      </w:r>
+    </w:p>
+    <w:p>
+      <w:pPr>
+        <w:pStyle w:val="BodyText"/>
+      </w:pPr>
+      <w:r>
+        <w:t xml:space="preserve">The ones that replace the hours she would otherwise have spent scratching out survival directly from the land.</w:t>
+      </w:r>
+    </w:p>
+    <w:p>
+      <w:pPr>
+        <w:pStyle w:val="BodyText"/>
+      </w:pPr>
+      <w:r>
+        <w:t xml:space="preserve">If she doesn’t sell enough nails to cover necessities, she stops functioning. She can’t make more nails if she’s starving. She can’t trade if she can’t get to market.</w:t>
+      </w:r>
+    </w:p>
+    <w:p>
+      <w:pPr>
+        <w:pStyle w:val="BodyText"/>
+      </w:pPr>
+      <w:r>
+        <w:t xml:space="preserve">This pile is non-negotiable. It’s the floor.</w:t>
       </w:r>
     </w:p>
     <w:p>
@@ -10103,7 +10127,31 @@
         <w:t xml:space="preserve"> </w:t>
       </w:r>
       <w:r>
-        <w:t xml:space="preserve">This is what lets her reinvest in her process. Buy better tools. Experiment with new materials. Investigate new steps to see if she can produce even more efficiently. Hire an apprentice. Surplus is security and leverage. It’s what keeps a bad harvest or a broken arm from turning into a spiral of disaster. This pile is both growth and resilience.</w:t>
+        <w:t xml:space="preserve">This is what lets her reinvest in her process.</w:t>
+      </w:r>
+    </w:p>
+    <w:p>
+      <w:pPr>
+        <w:pStyle w:val="BodyText"/>
+      </w:pPr>
+      <w:r>
+        <w:t xml:space="preserve">Buy better tools. Experiment with new materials. Investigate new steps to see if she can produce even more efficiently. Hire an apprentice.</w:t>
+      </w:r>
+    </w:p>
+    <w:p>
+      <w:pPr>
+        <w:pStyle w:val="BodyText"/>
+      </w:pPr>
+      <w:r>
+        <w:t xml:space="preserve">Surplus is security and leverage. It’s what keeps a bad harvest or a broken arm from turning into a spiral of disaster.</w:t>
+      </w:r>
+    </w:p>
+    <w:p>
+      <w:pPr>
+        <w:pStyle w:val="BodyText"/>
+      </w:pPr>
+      <w:r>
+        <w:t xml:space="preserve">This pile is both growth and resilience.</w:t>
       </w:r>
     </w:p>
     <w:p>
@@ -10129,7 +10177,31 @@
         <w:t xml:space="preserve"> </w:t>
       </w:r>
       <w:r>
-        <w:t xml:space="preserve">This pile is different. Even if the nail-maker throws away those thousand nails, nothing vital collapses. If she gives them away, she doesn’t miss anything. If she reshapes them into something new and it all goes wrong, there is no existential crisis. Maybe some days someone in the market needs extra. But for the most part, this excess is the part of value produced that can be risked freely. This pile is liberty.</w:t>
+        <w:t xml:space="preserve">This pile is different. Even if the nail-maker throws away those thousand nails, nothing vital collapses.</w:t>
+      </w:r>
+    </w:p>
+    <w:p>
+      <w:pPr>
+        <w:pStyle w:val="BodyText"/>
+      </w:pPr>
+      <w:r>
+        <w:t xml:space="preserve">If she gives them away, she doesn’t miss anything.</w:t>
+      </w:r>
+    </w:p>
+    <w:p>
+      <w:pPr>
+        <w:pStyle w:val="BodyText"/>
+      </w:pPr>
+      <w:r>
+        <w:t xml:space="preserve">If she reshapes them into something new and it all goes wrong, there is no existential crisis. Maybe some days someone in the market needs extra.</w:t>
+      </w:r>
+    </w:p>
+    <w:p>
+      <w:pPr>
+        <w:pStyle w:val="BodyText"/>
+      </w:pPr>
+      <w:r>
+        <w:t xml:space="preserve">But for the most part, this excess is the part of value produced that can be risked freely. This pile is liberty.</w:t>
       </w:r>
     </w:p>
     <w:p>
@@ -10153,7 +10225,55 @@
         <w:pStyle w:val="BodyText"/>
       </w:pPr>
       <w:r>
-        <w:t xml:space="preserve">It is fine if these experiments will go nowhere. A lot of hooks will be ugly. A lot of paper clips will be awkward. Most of the toys will fall apart. But every so often, something works. Maybe the paper clips turn out to be genuinely handy, and neighbors start asking for them. A new market. Maybe the kids’ stick toys are so charming that a traveler offers to buy a few to take to the next town. An expanded market. Maybe the nail-maker discovers she enjoys teaching kids how to build things as much as she enjoys hammering metal. New value produced.</w:t>
+        <w:t xml:space="preserve">It is fine if these experiments will go nowhere.</w:t>
+      </w:r>
+    </w:p>
+    <w:p>
+      <w:pPr>
+        <w:pStyle w:val="BodyText"/>
+      </w:pPr>
+      <w:r>
+        <w:t xml:space="preserve">A lot of hooks will be ugly.</w:t>
+      </w:r>
+    </w:p>
+    <w:p>
+      <w:pPr>
+        <w:pStyle w:val="BodyText"/>
+      </w:pPr>
+      <w:r>
+        <w:t xml:space="preserve">A lot of paper clips will be awkward.</w:t>
+      </w:r>
+    </w:p>
+    <w:p>
+      <w:pPr>
+        <w:pStyle w:val="BodyText"/>
+      </w:pPr>
+      <w:r>
+        <w:t xml:space="preserve">Most of the toys will fall apart.</w:t>
+      </w:r>
+    </w:p>
+    <w:p>
+      <w:pPr>
+        <w:pStyle w:val="BodyText"/>
+      </w:pPr>
+      <w:r>
+        <w:t xml:space="preserve">But every so often, something works. Maybe the paper clips turn out to be genuinely handy, and neighbors start asking for them. A new market.</w:t>
+      </w:r>
+    </w:p>
+    <w:p>
+      <w:pPr>
+        <w:pStyle w:val="BodyText"/>
+      </w:pPr>
+      <w:r>
+        <w:t xml:space="preserve">Maybe the kids’ stick toys are so charming that a traveler offers to buy a few to take to the next town. An expanded market.</w:t>
+      </w:r>
+    </w:p>
+    <w:p>
+      <w:pPr>
+        <w:pStyle w:val="BodyText"/>
+      </w:pPr>
+      <w:r>
+        <w:t xml:space="preserve">Maybe the nail-maker discovers she enjoys teaching kids how to build things as much as she enjoys hammering metal. New value produced.</w:t>
       </w:r>
     </w:p>
     <w:p>
@@ -10480,15 +10600,55 @@
         <w:t xml:space="preserve"> </w:t>
       </w:r>
       <w:r>
-        <w:t xml:space="preserve">Did that surprise teach you something about scarcity, quality, or demand that you didn’t know before? That’s the information price signals carry. That’s the coordination miracle: millions of people making independent decisions based on prices, and somehow it produces shirts, and phones, and food, and cars, and everything you see around you. No central planner. No master coordinator. Just strangers trading with strangers, guided by numbers that carry more information than any person could process.</w:t>
-      </w:r>
-    </w:p>
-    <w:p>
-      <w:pPr>
-        <w:pStyle w:val="BodyText"/>
-      </w:pPr>
-      <w:r>
-        <w:t xml:space="preserve">Markets work because strangers need a different logic than families do. Families operate on inefficient, dedicated individual-to-individual relationships. But you can’t scale that to a population. You cannot know everyone in a one-to-population setting. And because of markets and specialization, you don’t have to. You understand what is valuable to others not because you know them. You need something else. You need a signal that works without intimacy.</w:t>
+        <w:t xml:space="preserve">Did that surprise teach you something about scarcity, quality, or demand that you didn’t know before? That’s the information price signals carry.</w:t>
+      </w:r>
+    </w:p>
+    <w:p>
+      <w:pPr>
+        <w:pStyle w:val="BodyText"/>
+      </w:pPr>
+      <w:r>
+        <w:t xml:space="preserve">That’s the coordination miracle: millions of people making independent decisions based on prices, and somehow it produces shirts, and phones, and food, and cars, and everything you see around you.</w:t>
+      </w:r>
+    </w:p>
+    <w:p>
+      <w:pPr>
+        <w:pStyle w:val="BodyText"/>
+      </w:pPr>
+      <w:r>
+        <w:t xml:space="preserve">No central planner. No master coordinator. Just strangers trading with strangers, guided by numbers that carry more information than any person could process.</w:t>
+      </w:r>
+    </w:p>
+    <w:p>
+      <w:pPr>
+        <w:pStyle w:val="BodyText"/>
+      </w:pPr>
+      <w:r>
+        <w:t xml:space="preserve">Markets work because strangers need a different logic than families do.</w:t>
+      </w:r>
+    </w:p>
+    <w:p>
+      <w:pPr>
+        <w:pStyle w:val="BodyText"/>
+      </w:pPr>
+      <w:r>
+        <w:t xml:space="preserve">Families operate on inefficient, dedicated individual-to-individual relationships.</w:t>
+      </w:r>
+    </w:p>
+    <w:p>
+      <w:pPr>
+        <w:pStyle w:val="BodyText"/>
+      </w:pPr>
+      <w:r>
+        <w:t xml:space="preserve">But you can’t scale that to a population. You cannot know everyone in a one-to-population setting. And because of markets and specialization, you don’t have to.</w:t>
+      </w:r>
+    </w:p>
+    <w:p>
+      <w:pPr>
+        <w:pStyle w:val="BodyText"/>
+      </w:pPr>
+      <w:r>
+        <w:t xml:space="preserve">You understand what is valuable to others not because you know them. You need something else. You need a signal that works without intimacy.</w:t>
       </w:r>
     </w:p>
     <w:p>
@@ -10504,7 +10664,47 @@
         <w:pStyle w:val="BodyText"/>
       </w:pPr>
       <w:r>
-        <w:t xml:space="preserve">And when specialists become highly effective at value production and trade through price, surplus happens. The nail-maker makes ten thousand nails. She sells enough to meet her needs, sells the rest that she can to grow and develop, and as she becomes an expert she ends up with more capacity than she can use or sell. The wheat farmer plants a hundred acres instead of one. The weaver makes a thousand shirts instead of three. Everyone specializes, everyone advances, and ultimately the same number of people working the same number of days produce so much</w:t>
+        <w:t xml:space="preserve">And when specialists become highly effective at value production and trade through price, surplus happens.</w:t>
+      </w:r>
+    </w:p>
+    <w:p>
+      <w:pPr>
+        <w:pStyle w:val="BodyText"/>
+      </w:pPr>
+      <w:r>
+        <w:t xml:space="preserve">The nail-maker makes ten thousand nails.</w:t>
+      </w:r>
+    </w:p>
+    <w:p>
+      <w:pPr>
+        <w:pStyle w:val="BodyText"/>
+      </w:pPr>
+      <w:r>
+        <w:t xml:space="preserve">She sells enough to meet her needs, sells the rest that she can to grow and develop, and as she becomes an expert she ends up with more capacity than she can use or sell.</w:t>
+      </w:r>
+    </w:p>
+    <w:p>
+      <w:pPr>
+        <w:pStyle w:val="BodyText"/>
+      </w:pPr>
+      <w:r>
+        <w:t xml:space="preserve">The wheat farmer plants a hundred acres instead of one.</w:t>
+      </w:r>
+    </w:p>
+    <w:p>
+      <w:pPr>
+        <w:pStyle w:val="BodyText"/>
+      </w:pPr>
+      <w:r>
+        <w:t xml:space="preserve">The weaver makes a thousand shirts instead of three.</w:t>
+      </w:r>
+    </w:p>
+    <w:p>
+      <w:pPr>
+        <w:pStyle w:val="BodyText"/>
+      </w:pPr>
+      <w:r>
+        <w:t xml:space="preserve">Everyone specializes, everyone advances, and ultimately the same number of people working the same number of days produce so much</w:t>
       </w:r>
       <w:r>
         <w:t xml:space="preserve"> </w:t>
@@ -10644,7 +10844,15 @@
         <w:pStyle w:val="BodyText"/>
       </w:pPr>
       <w:r>
-        <w:t xml:space="preserve">Specialists producing abundantly above their basic subsistence needs and trading with strangers who are doing that as well. From the nail-maker selling ten thousand nails and paying some of the income from surplus toward a commonwealth service that protects her factory and her home from burning down. From the wheat farmer selling a hundred tons of grain. From the weaver selling a thousand shirts.</w:t>
+        <w:t xml:space="preserve">Specialists producing abundantly above their basic subsistence needs and trading with strangers who are doing that as well.</w:t>
+      </w:r>
+    </w:p>
+    <w:p>
+      <w:pPr>
+        <w:pStyle w:val="BodyText"/>
+      </w:pPr>
+      <w:r>
+        <w:t xml:space="preserve">From the nail-maker selling ten thousand nails and paying some of the income from surplus toward a commonwealth service that protects her factory and her home from burning down. From the wheat farmer selling a hundred tons of grain. From the weaver selling a thousand shirts.</w:t>
       </w:r>
     </w:p>
     <w:p>
@@ -10668,15 +10876,39 @@
         <w:pStyle w:val="BodyText"/>
       </w:pPr>
       <w:r>
-        <w:t xml:space="preserve">Think about the city council members debating that $812,000 purchase. Fire chief presenting. Finance committee reviewing. Citizens showing up to argue about taxes. Someone suggesting going used for $400K. Someone else saying you can’t cheap out on firefighter safety. Finally: 7-3 vote to approve.</w:t>
-      </w:r>
-    </w:p>
-    <w:p>
-      <w:pPr>
-        <w:pStyle w:val="BodyText"/>
-      </w:pPr>
-      <w:r>
-        <w:t xml:space="preserve">Those council members are counting on a capitalist engine humming in the background. Businesses creating jobs. Marketplace specialists creating value and exchanging it for wages or sales. Marketplace transactions generating enough to meet both necessities and surplus, set aside and pooled, can be turned into ladders and pumps.</w:t>
+        <w:t xml:space="preserve">Think about the city council members debating that $812,000 purchase. Fire chief presenting. Finance committee reviewing. Citizens showing up to argue about taxes. Someone suggesting going used for $400K. Someone else saying you can’t cheap out on firefighter safety.</w:t>
+      </w:r>
+    </w:p>
+    <w:p>
+      <w:pPr>
+        <w:pStyle w:val="BodyText"/>
+      </w:pPr>
+      <w:r>
+        <w:t xml:space="preserve">Finally: 7-3 vote to approve.</w:t>
+      </w:r>
+    </w:p>
+    <w:p>
+      <w:pPr>
+        <w:pStyle w:val="BodyText"/>
+      </w:pPr>
+      <w:r>
+        <w:t xml:space="preserve">Those council members are counting on a capitalist engine humming in the background. Businesses creating jobs.</w:t>
+      </w:r>
+    </w:p>
+    <w:p>
+      <w:pPr>
+        <w:pStyle w:val="BodyText"/>
+      </w:pPr>
+      <w:r>
+        <w:t xml:space="preserve">Marketplace specialists creating value and exchanging it for wages or sales.</w:t>
+      </w:r>
+    </w:p>
+    <w:p>
+      <w:pPr>
+        <w:pStyle w:val="BodyText"/>
+      </w:pPr>
+      <w:r>
+        <w:t xml:space="preserve">Marketplace transactions generating enough to meet both necessities and surplus, set aside and pooled, can be turned into ladders and pumps.</w:t>
       </w:r>
     </w:p>
     <w:p>
@@ -10690,27 +10922,69 @@
         </w:rPr>
         <w:t xml:space="preserve">Think about the taxes that fund your local fire department. Where did that money come from originally?</w:t>
       </w:r>
-      <w:r>
-        <w:t xml:space="preserve"> </w:t>
-      </w:r>
-      <w:r>
-        <w:t xml:space="preserve">Trace it back. You’ll find it started as market activity; someone created value and exchanged it with someone else who had created value.</w:t>
-      </w:r>
-    </w:p>
-    <w:p>
-      <w:pPr>
-        <w:pStyle w:val="BodyText"/>
-      </w:pPr>
-      <w:r>
-        <w:t xml:space="preserve">This is one of the key connections between habitats. The engine underwrites the commons. Markets fund safety. Surplus enables collective investment in meeting shared human needs at scale in ways that are impractical for the nail maker herself.</w:t>
-      </w:r>
-    </w:p>
-    <w:p>
-      <w:pPr>
-        <w:pStyle w:val="BodyText"/>
-      </w:pPr>
-      <w:r>
-        <w:t xml:space="preserve">And it’s not just fire trucks. It’s police. It’s roads. It’s sewage systems. It’s parks. It’s all the infrastructure that makes daily life work. All of it funded by surplus generated through market activity. All of it dependent on the engine running well enough to create resources in abundance beyond survival.</w:t>
+    </w:p>
+    <w:p>
+      <w:pPr>
+        <w:pStyle w:val="BodyText"/>
+      </w:pPr>
+      <w:r>
+        <w:t xml:space="preserve">Trace it back.</w:t>
+      </w:r>
+    </w:p>
+    <w:p>
+      <w:pPr>
+        <w:pStyle w:val="BodyText"/>
+      </w:pPr>
+      <w:r>
+        <w:t xml:space="preserve">You’ll find it started as market activity; someone created value and exchanged it with someone else who had created value.</w:t>
+      </w:r>
+    </w:p>
+    <w:p>
+      <w:pPr>
+        <w:pStyle w:val="BodyText"/>
+      </w:pPr>
+      <w:r>
+        <w:t xml:space="preserve">This is one of the key connections between habitats.</w:t>
+      </w:r>
+    </w:p>
+    <w:p>
+      <w:pPr>
+        <w:pStyle w:val="BodyText"/>
+      </w:pPr>
+      <w:r>
+        <w:t xml:space="preserve">The engine underwrites the commons.</w:t>
+      </w:r>
+    </w:p>
+    <w:p>
+      <w:pPr>
+        <w:pStyle w:val="BodyText"/>
+      </w:pPr>
+      <w:r>
+        <w:t xml:space="preserve">Markets fund safety.</w:t>
+      </w:r>
+    </w:p>
+    <w:p>
+      <w:pPr>
+        <w:pStyle w:val="BodyText"/>
+      </w:pPr>
+      <w:r>
+        <w:t xml:space="preserve">Surplus enables collective investment in meeting shared human needs at scale in ways that are impractical for the nail maker herself.</w:t>
+      </w:r>
+    </w:p>
+    <w:p>
+      <w:pPr>
+        <w:pStyle w:val="BodyText"/>
+      </w:pPr>
+      <w:r>
+        <w:t xml:space="preserve">And it’s not just fire trucks. It’s police. It’s roads. It’s sewage systems. It’s parks. It’s all the infrastructure that makes daily life work.</w:t>
+      </w:r>
+    </w:p>
+    <w:p>
+      <w:pPr>
+        <w:pStyle w:val="BodyText"/>
+      </w:pPr>
+      <w:r>
+        <w:t xml:space="preserve">All of it funded by surplus generated through market activity. All of it dependent on the engine running well enough to create resources in abundance beyond survival.</w:t>
       </w:r>
     </w:p>
     <w:p>
@@ -10726,7 +11000,15 @@
         <w:pStyle w:val="BodyText"/>
       </w:pPr>
       <w:r>
-        <w:t xml:space="preserve">A fire department can be honorable and brave and still be incapable of responding if its trucks are rusting out and its radios don’t work. Safety systems depend on advancing technology and production capacity that can meet commonwealth scale needs—funded by surplus generated by the market habitat.</w:t>
+        <w:t xml:space="preserve">A fire department can be honorable and brave and still be incapable of responding if its trucks are rusting out and its radios don’t work.</w:t>
+      </w:r>
+    </w:p>
+    <w:p>
+      <w:pPr>
+        <w:pStyle w:val="BodyText"/>
+      </w:pPr>
+      <w:r>
+        <w:t xml:space="preserve">Safety systems depend on advancing technology and production capacity that can meet commonwealth scale needs—funded by surplus generated by the market habitat.</w:t>
       </w:r>
     </w:p>
     <w:p>
@@ -10810,7 +11092,23 @@
         <w:t xml:space="preserve"> </w:t>
       </w:r>
       <w:r>
-        <w:t xml:space="preserve">The nail-maker bends her extra nails into hooks and clips. Some experiments fail. Some succeed. The successful ones become new products, new businesses, new possibilities. She invests in exploration. She funds innovation. She takes risks that might not pay off in exploring the adjacent possible. This is how new ventures happen. R&amp;D, startups, art, research. They’re all best funded by excess that can be risked without threatening survival.</w:t>
+        <w:t xml:space="preserve">The nail-maker bends her extra nails into hooks and clips. Some experiments fail. Some succeed.</w:t>
+      </w:r>
+    </w:p>
+    <w:p>
+      <w:pPr>
+        <w:pStyle w:val="BodyText"/>
+      </w:pPr>
+      <w:r>
+        <w:t xml:space="preserve">The successful ones become new products, new businesses, new possibilities. She invests in exploration. She funds innovation. She takes risks that might not pay off in exploring the adjacent possible.</w:t>
+      </w:r>
+    </w:p>
+    <w:p>
+      <w:pPr>
+        <w:pStyle w:val="BodyText"/>
+      </w:pPr>
+      <w:r>
+        <w:t xml:space="preserve">This is how new ventures happen. R&amp;D, startups, art, research. They’re all best funded by excess that can be risked without threatening survival.</w:t>
       </w:r>
     </w:p>
     <w:p>
@@ -10828,7 +11126,23 @@
         <w:t xml:space="preserve"> </w:t>
       </w:r>
       <w:r>
-        <w:t xml:space="preserve">The nail-maker gives her extra nails to kids who want to build toys. She teaches them how to use the nails. She provides resources to those who need them but can’t pay. She funds others’ opportunities. She supports what markets can’t price. This is how sustainable giving happens. Not from burning your necessities, but from sharing your abundance.</w:t>
+        <w:t xml:space="preserve">The nail-maker gives her extra nails to kids who want to build toys.</w:t>
+      </w:r>
+    </w:p>
+    <w:p>
+      <w:pPr>
+        <w:pStyle w:val="BodyText"/>
+      </w:pPr>
+      <w:r>
+        <w:t xml:space="preserve">She teaches them how to use the nails. She provides resources to those who need them but can’t pay. She funds others’ opportunities. She supports what markets can’t price.</w:t>
+      </w:r>
+    </w:p>
+    <w:p>
+      <w:pPr>
+        <w:pStyle w:val="BodyText"/>
+      </w:pPr>
+      <w:r>
+        <w:t xml:space="preserve">This is how sustainable giving happens. Not from burning your necessities, but from sharing your abundance.</w:t>
       </w:r>
     </w:p>
     <w:p>
@@ -10928,7 +11242,7 @@
         <w:pStyle w:val="BodyText"/>
       </w:pPr>
       <w:r>
-        <w:t xml:space="preserve">You were born into a family. You didn’t choose your parents. You didn’t audition for the role of son or daughter. You didn’t negotiate the terms of your arrival. You showed up, helpless and hungry, and people who shared your blood decided—without asking you—that you belonged to them.</w:t>
+        <w:t xml:space="preserve">You were born into a family. You didn’t choose your parents. You didn’t audition for the role of son or daughter. You didn’t negotiate the terms of your arrival. You showed up, helpless and hungry, and people who shared your blood decided (without asking you) that you belonged to them.</w:t>
       </w:r>
     </w:p>
     <w:p>
@@ -10956,7 +11270,15 @@
         <w:t xml:space="preserve"> </w:t>
       </w:r>
       <w:r>
-        <w:t xml:space="preserve">to you. The holidays that feel sacred. The facial expressions you make without thinking. The fears you inherited. The loves you absorbed. All of it installed before you could consent. All of it forming the bedrock of who you are before you became anyone in particular.</w:t>
+        <w:t xml:space="preserve">to you. The holidays that feel sacred. The facial expressions you make without thinking. The fears you inherited. The loves you absorbed.</w:t>
+      </w:r>
+    </w:p>
+    <w:p>
+      <w:pPr>
+        <w:pStyle w:val="BodyText"/>
+      </w:pPr>
+      <w:r>
+        <w:t xml:space="preserve">All of it installed before you could consent. All of it forming the bedrock of who you are before you became anyone in particular.</w:t>
       </w:r>
     </w:p>
     <w:p>
@@ -10972,7 +11294,7 @@
         <w:pStyle w:val="BodyText"/>
       </w:pPr>
       <w:r>
-        <w:t xml:space="preserve">You picked friends. Not because they shared your blood but because they shared something else—a sense of humor, a fascination, a way of seeing the world. You joined groups. You left groups. You tried on identities like clothes, discarding some, keeping others. You became a musician, an athlete, a nerd, a rebel, a mentor, a colleague, a confidant.</w:t>
+        <w:t xml:space="preserve">You picked friends. Not because they shared your blood but because they shared something else: a sense of humor, a fascination, a way of seeing the world. You joined groups. You left groups. You tried on identities like clothes, discarding some, keeping others. You became a musician, an athlete, a nerd, a rebel, a mentor, a colleague, a confidant.</w:t>
       </w:r>
     </w:p>
     <w:p>
@@ -11001,7 +11323,7 @@
         <w:t xml:space="preserve">you</w:t>
       </w:r>
       <w:r>
-        <w:t xml:space="preserve">—not a population category, not a demographic segment, not an economic actor. When your friend shows up to help you move, they’re not doing it because you’re a member of the general public. They’re doing it because you’re</w:t>
+        <w:t xml:space="preserve">. Not a population category, not a demographic segment, not an economic actor. When your friend shows up to help you move, they’re not doing it because you’re a member of the general public. They’re doing it because you’re</w:t>
       </w:r>
       <w:r>
         <w:t xml:space="preserve"> </w:t>
@@ -11085,7 +11407,7 @@
         <w:t xml:space="preserve"> </w:t>
       </w:r>
       <w:r>
-        <w:t xml:space="preserve">come from? Where do we get the sense that a stranger on fire deserves rescue—that their burning is</w:t>
+        <w:t xml:space="preserve">come from? Where do we get the sense that a stranger on fire deserves rescue; that their burning is</w:t>
       </w:r>
       <w:r>
         <w:t xml:space="preserve"> </w:t>
@@ -11125,7 +11447,10 @@
         <w:pStyle w:val="BodyText"/>
       </w:pPr>
       <w:r>
-        <w:t xml:space="preserve">That insight—</w:t>
+        <w:t xml:space="preserve">That insight,</w:t>
+      </w:r>
+      <w:r>
+        <w:t xml:space="preserve"> </w:t>
       </w:r>
       <w:r>
         <w:rPr>
@@ -11135,15 +11460,31 @@
         <w:t xml:space="preserve">people matter before they produce</w:t>
       </w:r>
       <w:r>
-        <w:t xml:space="preserve">—is what makes the safety commons possible. Without it, we’d have no concept of shared human needs that deserve protection. We’d only have buyers and sellers, winners and losers, contributors and freeloaders. The fire department would be Uber for house fires: tap a button, and competing crews bid on your emergency.</w:t>
-      </w:r>
-    </w:p>
-    <w:p>
-      <w:pPr>
-        <w:pStyle w:val="BodyText"/>
-      </w:pPr>
-      <w:r>
-        <w:t xml:space="preserve">But we don’t do that. Because something in us knows—from the kitchen table, from the bassinet, from the bedtime story read by someone who was too tired but did it anyway—that some things we owe to each other simply because we’re human.</w:t>
+        <w:t xml:space="preserve">, is what makes the safety commons possible.</w:t>
+      </w:r>
+    </w:p>
+    <w:p>
+      <w:pPr>
+        <w:pStyle w:val="BodyText"/>
+      </w:pPr>
+      <w:r>
+        <w:t xml:space="preserve">Without it, we’d have no concept of shared human needs that deserve protection. We’d only have buyers and sellers, winners and losers, contributors and freeloaders. The fire department would be Uber for house fires: tap a button, and competing crews bid on your emergency.</w:t>
+      </w:r>
+    </w:p>
+    <w:p>
+      <w:pPr>
+        <w:pStyle w:val="BodyText"/>
+      </w:pPr>
+      <w:r>
+        <w:t xml:space="preserve">But we don’t do that.</w:t>
+      </w:r>
+    </w:p>
+    <w:p>
+      <w:pPr>
+        <w:pStyle w:val="BodyText"/>
+      </w:pPr>
+      <w:r>
+        <w:t xml:space="preserve">Because something in us knows; from the kitchen table, from the bassinet, from the bedtime story read by someone who was too tired but did it anyway; that some things we owe to each other simply because we’re human.</w:t>
       </w:r>
     </w:p>
     <w:p>
@@ -11197,7 +11538,67 @@
         <w:pStyle w:val="BodyText"/>
       </w:pPr>
       <w:r>
-        <w:t xml:space="preserve">When you walk into a supermarket, you face ten thousand products. Every one of them represents someone’s bet that you’ll want it—that your preferences, your tastes, your specific</w:t>
+        <w:t xml:space="preserve">Now watch the parallel.</w:t>
+      </w:r>
+    </w:p>
+    <w:p>
+      <w:pPr>
+        <w:pStyle w:val="BodyText"/>
+      </w:pPr>
+      <w:r>
+        <w:t xml:space="preserve">The family teaches us to provide for those we can see. Your children. Your spouse. Your parents as they age. You give to them not because they’ve earned it, not because they’ve paid for it, but because of who you are.</w:t>
+      </w:r>
+    </w:p>
+    <w:p>
+      <w:pPr>
+        <w:pStyle w:val="BodyText"/>
+      </w:pPr>
+      <w:r>
+        <w:t xml:space="preserve">You’re a parent.</w:t>
+      </w:r>
+    </w:p>
+    <w:p>
+      <w:pPr>
+        <w:pStyle w:val="BodyText"/>
+      </w:pPr>
+      <w:r>
+        <w:t xml:space="preserve">You’re a spouse.</w:t>
+      </w:r>
+    </w:p>
+    <w:p>
+      <w:pPr>
+        <w:pStyle w:val="BodyText"/>
+      </w:pPr>
+      <w:r>
+        <w:t xml:space="preserve">You’re a son, a daughter, a sibling.</w:t>
+      </w:r>
+    </w:p>
+    <w:p>
+      <w:pPr>
+        <w:pStyle w:val="BodyText"/>
+      </w:pPr>
+      <w:r>
+        <w:t xml:space="preserve">The identity given by family creates an obligation to provide for those within your sight.</w:t>
+      </w:r>
+    </w:p>
+    <w:p>
+      <w:pPr>
+        <w:pStyle w:val="BodyText"/>
+      </w:pPr>
+      <w:r>
+        <w:t xml:space="preserve">And that same identity, that same sense of</w:t>
+      </w:r>
+      <w:r>
+        <w:t xml:space="preserve"> </w:t>
+      </w:r>
+      <w:r>
+        <w:t xml:space="preserve">“this is who I am and therefore I provide,”</w:t>
+      </w:r>
+      <w:r>
+        <w:t xml:space="preserve"> </w:t>
+      </w:r>
+      <w:r>
+        <w:t xml:space="preserve">extends through the safety commons to strangers you’ll never meet. We fund the fire truck for the family three blocks over because our given identity taught us that humans matter before they produce. The family creates the</w:t>
       </w:r>
       <w:r>
         <w:t xml:space="preserve"> </w:t>
@@ -11207,87 +11608,10 @@
           <w:i/>
           <w:iCs/>
         </w:rPr>
-        <w:t xml:space="preserve">you-ness</w:t>
-      </w:r>
-      <w:r>
-        <w:t xml:space="preserve"> </w:t>
-      </w:r>
-      <w:r>
-        <w:t xml:space="preserve">will lead you to pick this cereal instead of that one, this shirt instead of the other.</w:t>
-      </w:r>
-    </w:p>
-    <w:p>
-      <w:pPr>
-        <w:pStyle w:val="BodyText"/>
-      </w:pPr>
-      <w:r>
-        <w:t xml:space="preserve">But how do you know what you want?</w:t>
-      </w:r>
-    </w:p>
-    <w:p>
-      <w:pPr>
-        <w:pStyle w:val="BodyText"/>
-      </w:pPr>
-      <w:r>
-        <w:t xml:space="preserve">You learned it. Somewhere. From someone. In relationships where you were free to choose.</w:t>
-      </w:r>
-    </w:p>
-    <w:p>
-      <w:pPr>
-        <w:pStyle w:val="BodyText"/>
-      </w:pPr>
-      <w:r>
-        <w:t xml:space="preserve">Your friends introduced you to bands you didn’t know. Your running group showed you what gear actually works. Your book club expanded your sense of what’s worth reading. Your professional network taught you what skills are valued, what conferences matter, what credentials open doors. Your mentors shaped your sense of what kind of person you’re trying to become.</w:t>
-      </w:r>
-    </w:p>
-    <w:p>
-      <w:pPr>
-        <w:pStyle w:val="BodyText"/>
-      </w:pPr>
-      <w:r>
-        <w:t xml:space="preserve">All of this happened in voluntary, individual-to-individual relationships where you were free to show up or leave, to adopt or reject, to try on identities and keep the ones that fit.</w:t>
-      </w:r>
-    </w:p>
-    <w:p>
-      <w:pPr>
-        <w:pStyle w:val="BodyText"/>
-      </w:pPr>
-      <w:r>
-        <w:t xml:space="preserve">This is the friendship habitat’s gift to the market: it gives you a self to bring.</w:t>
-      </w:r>
-    </w:p>
-    <w:p>
-      <w:pPr>
-        <w:pStyle w:val="BodyText"/>
-      </w:pPr>
-      <w:r>
-        <w:t xml:space="preserve">Without chosen identity, you’d be a passive recipient of whatever signals reached you. You’d have no preferences—only programming. You’d have no sense of</w:t>
-      </w:r>
-      <w:r>
-        <w:t xml:space="preserve"> </w:t>
-      </w:r>
-      <w:r>
-        <w:t xml:space="preserve">“this is who I want to become,”</w:t>
-      </w:r>
-      <w:r>
-        <w:t xml:space="preserve"> </w:t>
-      </w:r>
-      <w:r>
-        <w:t xml:space="preserve">only</w:t>
-      </w:r>
-      <w:r>
-        <w:t xml:space="preserve"> </w:t>
-      </w:r>
-      <w:r>
-        <w:t xml:space="preserve">“this is what’s available.”</w:t>
-      </w:r>
-    </w:p>
-    <w:p>
-      <w:pPr>
-        <w:pStyle w:val="BodyText"/>
-      </w:pPr>
-      <w:r>
-        <w:t xml:space="preserve">Markets need participants who know what they value. Otherwise, price signals carry nothing but noise. The market asks:</w:t>
+        <w:t xml:space="preserve">giver</w:t>
+      </w:r>
+      <w:r>
+        <w:t xml:space="preserve">. The commons creates the</w:t>
       </w:r>
       <w:r>
         <w:t xml:space="preserve"> </w:t>
@@ -11297,13 +11621,244 @@
           <w:i/>
           <w:iCs/>
         </w:rPr>
-        <w:t xml:space="preserve">What do you want?</w:t>
-      </w:r>
-      <w:r>
-        <w:t xml:space="preserve"> </w:t>
-      </w:r>
-      <w:r>
-        <w:t xml:space="preserve">The friendship habitat answers:</w:t>
+        <w:t xml:space="preserve">reach</w:t>
+      </w:r>
+      <w:r>
+        <w:t xml:space="preserve">.</w:t>
+      </w:r>
+    </w:p>
+    <w:p>
+      <w:pPr>
+        <w:pStyle w:val="BodyText"/>
+      </w:pPr>
+      <w:r>
+        <w:t xml:space="preserve">Friendship does the same thing for the market, but in a different key.</w:t>
+      </w:r>
+    </w:p>
+    <w:p>
+      <w:pPr>
+        <w:pStyle w:val="BodyText"/>
+      </w:pPr>
+      <w:r>
+        <w:t xml:space="preserve">In friendships, you discovered who you want to become. Not who you were assigned to be, but who you chose to be.</w:t>
+      </w:r>
+    </w:p>
+    <w:p>
+      <w:pPr>
+        <w:pStyle w:val="BodyText"/>
+      </w:pPr>
+      <w:r>
+        <w:t xml:space="preserve">Your friends didn’t just introduce you to music or books or ideas. They showed you what kind of person you admired.</w:t>
+      </w:r>
+    </w:p>
+    <w:p>
+      <w:pPr>
+        <w:pStyle w:val="BodyText"/>
+      </w:pPr>
+      <w:r>
+        <w:t xml:space="preserve">What kind of work felt meaningful.</w:t>
+      </w:r>
+    </w:p>
+    <w:p>
+      <w:pPr>
+        <w:pStyle w:val="BodyText"/>
+      </w:pPr>
+      <w:r>
+        <w:t xml:space="preserve">What standards you wanted to hold yourself to.</w:t>
+      </w:r>
+    </w:p>
+    <w:p>
+      <w:pPr>
+        <w:pStyle w:val="BodyText"/>
+      </w:pPr>
+      <w:r>
+        <w:t xml:space="preserve">What reputation you wanted to build.</w:t>
+      </w:r>
+    </w:p>
+    <w:p>
+      <w:pPr>
+        <w:pStyle w:val="BodyText"/>
+      </w:pPr>
+      <w:r>
+        <w:t xml:space="preserve">You tried on identities: the reliable one, the creative one, the meticulous one, the funny one, the one who shows up early, the one who stays late, the one who notices what others miss.</w:t>
+      </w:r>
+    </w:p>
+    <w:p>
+      <w:pPr>
+        <w:pStyle w:val="BodyText"/>
+      </w:pPr>
+      <w:r>
+        <w:t xml:space="preserve">Some fit. Some didn’t.</w:t>
+      </w:r>
+    </w:p>
+    <w:p>
+      <w:pPr>
+        <w:pStyle w:val="BodyText"/>
+      </w:pPr>
+      <w:r>
+        <w:t xml:space="preserve">Through voluntary relationships where you were free to experiment and fail and try again, you assembled a chosen identity. A sense of the kind of specialist you wanted to become.</w:t>
+      </w:r>
+    </w:p>
+    <w:p>
+      <w:pPr>
+        <w:pStyle w:val="BodyText"/>
+      </w:pPr>
+      <w:r>
+        <w:t xml:space="preserve">And then you brought that identity to the market.</w:t>
+      </w:r>
+    </w:p>
+    <w:p>
+      <w:pPr>
+        <w:pStyle w:val="BodyText"/>
+      </w:pPr>
+      <w:r>
+        <w:t xml:space="preserve">This is the crucial insight everyone misses:</w:t>
+      </w:r>
+      <w:r>
+        <w:t xml:space="preserve"> </w:t>
+      </w:r>
+      <w:r>
+        <w:rPr>
+          <w:b/>
+          <w:bCs/>
+        </w:rPr>
+        <w:t xml:space="preserve">your chosen identity doesn’t primarily inform what you buy. It informs what you produce.</w:t>
+      </w:r>
+    </w:p>
+    <w:p>
+      <w:pPr>
+        <w:pStyle w:val="BodyText"/>
+      </w:pPr>
+      <w:r>
+        <w:t xml:space="preserve">When the nail-maker walks into the marketplace, she doesn’t just bring nails.</w:t>
+      </w:r>
+    </w:p>
+    <w:p>
+      <w:pPr>
+        <w:pStyle w:val="BodyText"/>
+      </w:pPr>
+      <w:r>
+        <w:t xml:space="preserve">She brings herself. She brings an identity she’s constructed through years of friendships and mentorships and voluntary affiliations. She’s the trustworthy nail-maker. The meticulous one. The one whose nails don’t bend. The one who delivers on time. The one whose word is her bond.</w:t>
+      </w:r>
+    </w:p>
+    <w:p>
+      <w:pPr>
+        <w:pStyle w:val="BodyText"/>
+      </w:pPr>
+      <w:r>
+        <w:t xml:space="preserve">Or she’s the innovative one, the one who experiments, who makes paper clips and hooks and strange new fasteners nobody asked for but everyone wants once they see them.</w:t>
+      </w:r>
+    </w:p>
+    <w:p>
+      <w:pPr>
+        <w:pStyle w:val="BodyText"/>
+      </w:pPr>
+      <w:r>
+        <w:t xml:space="preserve">That identity, that reputation, that chosen self, is what she offers to the ten thousand strangers who will buy her nails without ever knowing her name.</w:t>
+      </w:r>
+    </w:p>
+    <w:p>
+      <w:pPr>
+        <w:pStyle w:val="BodyText"/>
+      </w:pPr>
+      <w:r>
+        <w:t xml:space="preserve">Think about what this means.</w:t>
+      </w:r>
+    </w:p>
+    <w:p>
+      <w:pPr>
+        <w:pStyle w:val="BodyText"/>
+      </w:pPr>
+      <w:r>
+        <w:t xml:space="preserve">The market is individual-to-population.</w:t>
+      </w:r>
+    </w:p>
+    <w:p>
+      <w:pPr>
+        <w:pStyle w:val="BodyText"/>
+      </w:pPr>
+      <w:r>
+        <w:t xml:space="preserve">You produce for people you’ll never meet. You can’t know their needs the way you know your family’s needs.</w:t>
+      </w:r>
+    </w:p>
+    <w:p>
+      <w:pPr>
+        <w:pStyle w:val="BodyText"/>
+      </w:pPr>
+      <w:r>
+        <w:t xml:space="preserve">You can’t read their faces, hear their stories, understand their circumstances. You face an anonymous crowd of potential buyers stretching to the horizon.</w:t>
+      </w:r>
+    </w:p>
+    <w:p>
+      <w:pPr>
+        <w:pStyle w:val="BodyText"/>
+      </w:pPr>
+      <w:r>
+        <w:t xml:space="preserve">So how do you decide what to offer them?</w:t>
+      </w:r>
+    </w:p>
+    <w:p>
+      <w:pPr>
+        <w:pStyle w:val="BodyText"/>
+      </w:pPr>
+      <w:r>
+        <w:t xml:space="preserve">You bring yourself.</w:t>
+      </w:r>
+    </w:p>
+    <w:p>
+      <w:pPr>
+        <w:pStyle w:val="BodyText"/>
+      </w:pPr>
+      <w:r>
+        <w:t xml:space="preserve">You bring the identity you’ve assembled through countless voluntary relationships where people chose to know you, chose to mentor you, chose to tell you the truth about your work and your character.</w:t>
+      </w:r>
+    </w:p>
+    <w:p>
+      <w:pPr>
+        <w:pStyle w:val="BodyText"/>
+      </w:pPr>
+      <w:r>
+        <w:t xml:space="preserve">That chosen identity becomes your market identity: the signal that tells strangers what they can expect from you even though they’ve never met you.</w:t>
+      </w:r>
+    </w:p>
+    <w:p>
+      <w:pPr>
+        <w:pStyle w:val="BodyText"/>
+      </w:pPr>
+      <w:r>
+        <w:t xml:space="preserve">Just as your given identity from family, extended through the commons, enables you to provide protection for strangers (because</w:t>
+      </w:r>
+      <w:r>
+        <w:t xml:space="preserve"> </w:t>
+      </w:r>
+      <w:r>
+        <w:t xml:space="preserve">“providing for those who need it”</w:t>
+      </w:r>
+      <w:r>
+        <w:t xml:space="preserve"> </w:t>
+      </w:r>
+      <w:r>
+        <w:t xml:space="preserve">is who you are), your chosen identity from friendships, extended through the market, enables you to provide specialized value for strangers (because</w:t>
+      </w:r>
+      <w:r>
+        <w:t xml:space="preserve"> </w:t>
+      </w:r>
+      <w:r>
+        <w:t xml:space="preserve">“producing excellent work in this particular way”</w:t>
+      </w:r>
+      <w:r>
+        <w:t xml:space="preserve"> </w:t>
+      </w:r>
+      <w:r>
+        <w:t xml:space="preserve">is who you’ve become).</w:t>
+      </w:r>
+    </w:p>
+    <w:p>
+      <w:pPr>
+        <w:pStyle w:val="BodyText"/>
+      </w:pPr>
+      <w:r>
+        <w:t xml:space="preserve">The family gives us the</w:t>
       </w:r>
       <w:r>
         <w:t xml:space="preserve"> </w:t>
@@ -11313,215 +11868,369 @@
           <w:i/>
           <w:iCs/>
         </w:rPr>
-        <w:t xml:space="preserve">I’ve figured out who I am. Let me show you.</w:t>
-      </w:r>
-    </w:p>
-    <w:p>
-      <w:pPr>
-        <w:pStyle w:val="BodyText"/>
-      </w:pPr>
-      <w:r>
-        <w:t xml:space="preserve">Friendships give you the chosen identity that guides your purchases, your career, your investments. And in turn, the market gives friendships something precious: specialization. Your years of becoming excellent at something mean you have something to offer your friends beyond your presence. The engineer helps redesign the nonprofit’s database. The accountant reviews the church’s books. The chef cooks for the wedding. The plumber fixes the leak. Specialized skills, developed in the marketplace, deployed in friendship—not for pay, but because that’s what people who share chosen identity do for each other.</w:t>
-      </w:r>
-    </w:p>
-    <w:p>
-      <w:pPr>
-        <w:pStyle w:val="BodyText"/>
-      </w:pPr>
-      <w:r>
-        <w:t xml:space="preserve">This is the mutual dependency that makes The Ring work:</w:t>
-      </w:r>
-    </w:p>
-    <w:p>
-      <w:pPr>
-        <w:pStyle w:val="BodyText"/>
-      </w:pPr>
+        <w:t xml:space="preserve">giver</w:t>
+      </w:r>
+      <w:r>
+        <w:t xml:space="preserve"> </w:t>
+      </w:r>
+      <w:r>
+        <w:t xml:space="preserve">who extends through the commons.</w:t>
+      </w:r>
+      <w:r>
+        <w:t xml:space="preserve"> </w:t>
+      </w:r>
+      <w:r>
+        <w:t xml:space="preserve">Friendship gives us the</w:t>
+      </w:r>
+      <w:r>
+        <w:t xml:space="preserve"> </w:t>
+      </w:r>
       <w:r>
         <w:rPr>
           <w:i/>
           <w:iCs/>
         </w:rPr>
-        <w:t xml:space="preserve">Family gives safety commons the concept of shared humanity.</w:t>
-      </w:r>
-      <w:r>
-        <w:t xml:space="preserve"> </w:t>
-      </w:r>
+        <w:t xml:space="preserve">producer</w:t>
+      </w:r>
+      <w:r>
+        <w:t xml:space="preserve"> </w:t>
+      </w:r>
+      <w:r>
+        <w:t xml:space="preserve">who extends through the market.</w:t>
+      </w:r>
+    </w:p>
+    <w:p>
+      <w:pPr>
+        <w:pStyle w:val="BodyText"/>
+      </w:pPr>
+      <w:r>
+        <w:t xml:space="preserve">Both are about what you bring to strangers you cannot see. The difference is what you bring. From family through commons: protection, safety, a share of the pooled insurance against disaster. From friendship through market: specialized value, refined production, the particular kind of excellence you’ve worked to achieve.</w:t>
+      </w:r>
+    </w:p>
+    <w:p>
+      <w:pPr>
+        <w:pStyle w:val="BodyText"/>
+      </w:pPr>
+      <w:r>
+        <w:t xml:space="preserve">And watch the return flow.</w:t>
+      </w:r>
+    </w:p>
+    <w:p>
+      <w:pPr>
+        <w:pStyle w:val="BodyText"/>
+      </w:pPr>
+      <w:r>
+        <w:t xml:space="preserve">The safety commons sends protection back to family. The fire truck that serves strangers also protects your own household. The pooled insurance that covers the population also catches you when you fall.</w:t>
+      </w:r>
+    </w:p>
+    <w:p>
+      <w:pPr>
+        <w:pStyle w:val="BodyText"/>
+      </w:pPr>
+      <w:r>
+        <w:t xml:space="preserve">The commons, funded by given identity extended to strangers, returns to strengthen the families that created that identity in the first place.</w:t>
+      </w:r>
+    </w:p>
+    <w:p>
+      <w:pPr>
+        <w:pStyle w:val="BodyText"/>
+      </w:pPr>
+      <w:r>
+        <w:t xml:space="preserve">The market does the same for friendships. All those years of specialization, all that practice and refinement and expertise developed for anonymous strangers in the marketplace, all of it comes back home.</w:t>
+      </w:r>
+    </w:p>
+    <w:p>
+      <w:pPr>
+        <w:pStyle w:val="BodyText"/>
+      </w:pPr>
+      <w:r>
+        <w:t xml:space="preserve">The accountant reviews the church’s books for free. The plumber fixes a friend’s leak on Saturday morning with no invoice.</w:t>
+      </w:r>
+    </w:p>
+    <w:p>
+      <w:pPr>
+        <w:pStyle w:val="BodyText"/>
+      </w:pPr>
+      <w:r>
+        <w:t xml:space="preserve">The chef cooks for the wedding because that’s what a chef who loves you does.</w:t>
+      </w:r>
+    </w:p>
+    <w:p>
+      <w:pPr>
+        <w:pStyle w:val="BodyText"/>
+      </w:pPr>
+      <w:r>
+        <w:t xml:space="preserve">The engineer redesigns the nonprofit’s database because his skills, sharpened in market competition, are exactly what his chosen community needs.</w:t>
+      </w:r>
+    </w:p>
+    <w:p>
+      <w:pPr>
+        <w:pStyle w:val="BodyText"/>
+      </w:pPr>
+      <w:r>
+        <w:t xml:space="preserve">This is what markets give back to friendships: not just money, but mastery. The specialization that makes you valuable to strangers also makes you powerfully useful to the people you love by choice.</w:t>
+      </w:r>
+    </w:p>
+    <w:p>
+      <w:pPr>
+        <w:pStyle w:val="BodyText"/>
+      </w:pPr>
+      <w:r>
+        <w:t xml:space="preserve">And you deploy that mastery in the friendship habitat without price, without exchange, without calculating return, because that’s what chosen identity looks like when it comes home.</w:t>
+      </w:r>
+    </w:p>
+    <w:p>
+      <w:pPr>
+        <w:pStyle w:val="BodyText"/>
+      </w:pPr>
+      <w:r>
+        <w:t xml:space="preserve">The ring completes itself:</w:t>
+      </w:r>
+    </w:p>
+    <w:p>
+      <w:pPr>
+        <w:pStyle w:val="BodyText"/>
+      </w:pPr>
       <w:r>
         <w:rPr>
           <w:i/>
           <w:iCs/>
         </w:rPr>
-        <w:t xml:space="preserve">Safety commons gives family the protection to exist.</w:t>
-      </w:r>
-      <w:r>
-        <w:t xml:space="preserve"> </w:t>
-      </w:r>
+        <w:t xml:space="preserve">Family gives safety commons the concept of shared humanity: we provide for strangers because of who we are.</w:t>
+      </w:r>
+    </w:p>
+    <w:p>
+      <w:pPr>
+        <w:pStyle w:val="BodyText"/>
+      </w:pPr>
       <w:r>
         <w:rPr>
           <w:i/>
           <w:iCs/>
         </w:rPr>
-        <w:t xml:space="preserve">Friendship gives markets a self that knows what it values.</w:t>
-      </w:r>
-      <w:r>
-        <w:t xml:space="preserve"> </w:t>
-      </w:r>
+        <w:t xml:space="preserve">Safety commons gives family the protection to exist: pooled insurance returns to shelter the households that fund it.</w:t>
+      </w:r>
+    </w:p>
+    <w:p>
+      <w:pPr>
+        <w:pStyle w:val="BodyText"/>
+      </w:pPr>
       <w:r>
         <w:rPr>
           <w:i/>
           <w:iCs/>
         </w:rPr>
-        <w:t xml:space="preserve">Markets give friendship the specialization to make voluntary help powerful.</w:t>
-      </w:r>
-    </w:p>
-    <w:p>
-      <w:pPr>
-        <w:pStyle w:val="BodyText"/>
-      </w:pPr>
-      <w:r>
-        <w:t xml:space="preserve">But watch what happens when the engine forgets its place.</w:t>
-      </w:r>
-    </w:p>
-    <w:p>
-      <w:pPr>
-        <w:pStyle w:val="BodyText"/>
-      </w:pPr>
-      <w:r>
-        <w:rPr>
-          <w:b/>
-          <w:bCs/>
-        </w:rPr>
-        <w:t xml:space="preserve">When Market Logic Eats the Other Habitats</w:t>
-      </w:r>
-    </w:p>
-    <w:p>
-      <w:pPr>
-        <w:pStyle w:val="BodyText"/>
-      </w:pPr>
-      <w:r>
-        <w:t xml:space="preserve">Scale errors don’t just break things. They dissolve them. Market logic, applied to the wrong habitat, doesn’t fail politely. It corrodes the very relationships it touches.</w:t>
-      </w:r>
-    </w:p>
-    <w:p>
-      <w:pPr>
-        <w:pStyle w:val="BodyText"/>
-      </w:pPr>
-      <w:r>
-        <w:rPr>
-          <w:b/>
-          <w:bCs/>
-        </w:rPr>
-        <w:t xml:space="preserve">Market logic in family</w:t>
-      </w:r>
-      <w:r>
-        <w:t xml:space="preserve"> </w:t>
-      </w:r>
-      <w:r>
-        <w:t xml:space="preserve">turns the dinner table into a performance review. Start tracking who does more dishes. Start calculating the hourly value of childcare. Start invoicing your spouse for emotional labor. Watch what happens to the love. The moment you introduce exchange logic into</w:t>
-      </w:r>
-      <w:r>
-        <w:t xml:space="preserve"> </w:t>
-      </w:r>
-      <w:r>
-        <w:t xml:space="preserve">“from each according to ability, to each according to need,”</w:t>
-      </w:r>
-      <w:r>
-        <w:t xml:space="preserve"> </w:t>
-      </w:r>
-      <w:r>
-        <w:t xml:space="preserve">you’ve killed the thing that made it work. Children become cost centers. Parents become investors expecting ROI. The elderly become liabilities. Love becomes a transaction, and transactions can always be cancelled when the numbers don’t add up.</w:t>
-      </w:r>
-    </w:p>
-    <w:p>
-      <w:pPr>
-        <w:pStyle w:val="BodyText"/>
-      </w:pPr>
-      <w:r>
-        <w:rPr>
-          <w:b/>
-          <w:bCs/>
-        </w:rPr>
-        <w:t xml:space="preserve">Market logic in friendship</w:t>
-      </w:r>
-      <w:r>
-        <w:t xml:space="preserve"> </w:t>
-      </w:r>
-      <w:r>
-        <w:t xml:space="preserve">turns your chosen identity into a customer profile. Start asking</w:t>
-      </w:r>
-      <w:r>
-        <w:t xml:space="preserve"> </w:t>
-      </w:r>
-      <w:r>
-        <w:t xml:space="preserve">“what have you done for me lately?”</w:t>
-      </w:r>
-      <w:r>
-        <w:t xml:space="preserve"> </w:t>
-      </w:r>
-      <w:r>
-        <w:t xml:space="preserve">Start keeping score. Start treating your network as a collection of assets to be leveraged. Watch the invitations dry up. Watch people stop calling. They can tell. They always can. You’ve converted voluntary trust into transactional expectation, and the friendship habitat runs on the opposite: you show up because you want to, not because you’re getting paid. The moment it becomes a business relationship, it’s no longer a friendship. It’s a vendor arrangement.</w:t>
-      </w:r>
-    </w:p>
-    <w:p>
-      <w:pPr>
-        <w:pStyle w:val="BodyText"/>
-      </w:pPr>
-      <w:r>
-        <w:rPr>
-          <w:b/>
-          <w:bCs/>
-        </w:rPr>
-        <w:t xml:space="preserve">Market logic in safety commons</w:t>
-      </w:r>
-      <w:r>
-        <w:t xml:space="preserve"> </w:t>
-      </w:r>
-      <w:r>
-        <w:t xml:space="preserve">turns the fire department into a bidding war. Demand that emergency response be priced per incident. Require means-testing for ambulance rides. Introduce competitive providers for 911 dispatch. Watch people die in the gaps. The safety commons works because it’s impartial, standardized, and pre-funded. Strip that away—make it respond to price signals like a market—and you’ve destroyed the thing that makes</w:t>
-      </w:r>
-      <w:r>
-        <w:t xml:space="preserve"> </w:t>
-      </w:r>
-      <w:r>
-        <w:t xml:space="preserve">“we will come, whoever you are”</w:t>
-      </w:r>
-      <w:r>
-        <w:t xml:space="preserve"> </w:t>
-      </w:r>
-      <w:r>
-        <w:t xml:space="preserve">possible.</w:t>
-      </w:r>
-    </w:p>
-    <w:p>
-      <w:pPr>
-        <w:pStyle w:val="BodyText"/>
-      </w:pPr>
-      <w:r>
-        <w:t xml:space="preserve">But there’s a subtler version. Market logic doesn’t have to take over completely to cause damage. Sometimes it just asks the wrong questions.</w:t>
-      </w:r>
-    </w:p>
-    <w:p>
-      <w:pPr>
-        <w:pStyle w:val="BodyText"/>
-      </w:pPr>
-      <w:r>
-        <w:t xml:space="preserve">It asks the safety commons:</w:t>
-      </w:r>
-      <w:r>
-        <w:t xml:space="preserve"> </w:t>
-      </w:r>
+        <w:t xml:space="preserve">Friendship gives markets a self that knows how to produce: chosen identity becomes market identity.</w:t>
+      </w:r>
+    </w:p>
+    <w:p>
+      <w:pPr>
+        <w:pStyle w:val="BodyText"/>
+      </w:pPr>
       <w:r>
         <w:rPr>
           <w:i/>
           <w:iCs/>
         </w:rPr>
-        <w:t xml:space="preserve">Why are you inefficient? Why do your fire trucks sit idle? Why don’t you right-size for average demand?</w:t>
-      </w:r>
-      <w:r>
-        <w:t xml:space="preserve"> </w:t>
-      </w:r>
-      <w:r>
-        <w:t xml:space="preserve">And the safety commons answers:</w:t>
+        <w:t xml:space="preserve">Markets give friendship the specialization to make voluntary help powerful: refined skills return to serve chosen communities.</w:t>
+      </w:r>
+    </w:p>
+    <w:p>
+      <w:pPr>
+        <w:pStyle w:val="BodyText"/>
+      </w:pPr>
+      <w:r>
+        <w:t xml:space="preserve">This is the mutual dependency. This is why the habitats need each other. And this is why scale errors are so devastating: they don’t just break one habitat, they sever the connections that make the whole ring function.</w:t>
+      </w:r>
+    </w:p>
+    <w:p>
+      <w:pPr>
+        <w:pStyle w:val="BodyText"/>
+      </w:pPr>
+      <w:r>
+        <w:rPr>
+          <w:b/>
+          <w:bCs/>
+        </w:rPr>
+        <w:t xml:space="preserve">When Market Logic Eats the Other Habitats</w:t>
+      </w:r>
+    </w:p>
+    <w:p>
+      <w:pPr>
+        <w:pStyle w:val="BodyText"/>
+      </w:pPr>
+      <w:r>
+        <w:t xml:space="preserve">Scale errors don’t just break things. They dissolve them. Market logic, applied to the wrong habitat, doesn’t fail politely. It corrodes the very relationships it touches.</w:t>
+      </w:r>
+    </w:p>
+    <w:p>
+      <w:pPr>
+        <w:pStyle w:val="BodyText"/>
+      </w:pPr>
+      <w:r>
+        <w:rPr>
+          <w:b/>
+          <w:bCs/>
+        </w:rPr>
+        <w:t xml:space="preserve">Market logic in family</w:t>
+      </w:r>
+      <w:r>
+        <w:t xml:space="preserve"> </w:t>
+      </w:r>
+      <w:r>
+        <w:t xml:space="preserve">turns the dinner table into a performance review.</w:t>
+      </w:r>
+    </w:p>
+    <w:p>
+      <w:pPr>
+        <w:pStyle w:val="BodyText"/>
+      </w:pPr>
+      <w:r>
+        <w:t xml:space="preserve">Start tracking who does more dishes. Start calculating the hourly value of childcare. Start invoicing your spouse for emotional labor.</w:t>
+      </w:r>
+    </w:p>
+    <w:p>
+      <w:pPr>
+        <w:pStyle w:val="BodyText"/>
+      </w:pPr>
+      <w:r>
+        <w:t xml:space="preserve">Watch what happens to the love. The moment you introduce exchange logic into</w:t>
+      </w:r>
+      <w:r>
+        <w:t xml:space="preserve"> </w:t>
+      </w:r>
+      <w:r>
+        <w:t xml:space="preserve">“from each according to ability, to each according to need,”</w:t>
+      </w:r>
+      <w:r>
+        <w:t xml:space="preserve"> </w:t>
+      </w:r>
+      <w:r>
+        <w:t xml:space="preserve">you’ve killed the thing that made it work. Children become cost centers. Parents become investors expecting ROI. The elderly become liabilities.</w:t>
+      </w:r>
+    </w:p>
+    <w:p>
+      <w:pPr>
+        <w:pStyle w:val="BodyText"/>
+      </w:pPr>
+      <w:r>
+        <w:t xml:space="preserve">Love becomes a transaction, and transactions can always be cancelled when the numbers don’t add up.</w:t>
+      </w:r>
+    </w:p>
+    <w:p>
+      <w:pPr>
+        <w:pStyle w:val="BodyText"/>
+      </w:pPr>
+      <w:r>
+        <w:rPr>
+          <w:b/>
+          <w:bCs/>
+        </w:rPr>
+        <w:t xml:space="preserve">Market logic in friendship</w:t>
+      </w:r>
+      <w:r>
+        <w:t xml:space="preserve"> </w:t>
+      </w:r>
+      <w:r>
+        <w:t xml:space="preserve">turns your chosen identity into a customer profile.</w:t>
+      </w:r>
+    </w:p>
+    <w:p>
+      <w:pPr>
+        <w:pStyle w:val="BodyText"/>
+      </w:pPr>
+      <w:r>
+        <w:t xml:space="preserve">Start asking</w:t>
+      </w:r>
+      <w:r>
+        <w:t xml:space="preserve"> </w:t>
+      </w:r>
+      <w:r>
+        <w:t xml:space="preserve">“what have you done for me lately?”</w:t>
+      </w:r>
+      <w:r>
+        <w:t xml:space="preserve"> </w:t>
+      </w:r>
+      <w:r>
+        <w:t xml:space="preserve">Start keeping score. Start treating your network as a collection of assets to be leveraged.</w:t>
+      </w:r>
+    </w:p>
+    <w:p>
+      <w:pPr>
+        <w:pStyle w:val="BodyText"/>
+      </w:pPr>
+      <w:r>
+        <w:t xml:space="preserve">Watch the invitations dry up. Watch people stop calling. They can tell. They always can. You’ve converted voluntary trust into transactional expectation, and the friendship habitat runs on the opposite: you show up because you want to, not because you’re getting paid. The moment it becomes a business relationship, it’s no longer a friendship. It’s a vendor arrangement.</w:t>
+      </w:r>
+    </w:p>
+    <w:p>
+      <w:pPr>
+        <w:pStyle w:val="BodyText"/>
+      </w:pPr>
+      <w:r>
+        <w:rPr>
+          <w:b/>
+          <w:bCs/>
+        </w:rPr>
+        <w:t xml:space="preserve">Market logic in safety commons</w:t>
+      </w:r>
+      <w:r>
+        <w:t xml:space="preserve"> </w:t>
+      </w:r>
+      <w:r>
+        <w:t xml:space="preserve">turns the fire department into a bidding war.</w:t>
+      </w:r>
+    </w:p>
+    <w:p>
+      <w:pPr>
+        <w:pStyle w:val="BodyText"/>
+      </w:pPr>
+      <w:r>
+        <w:t xml:space="preserve">Demand that emergency response be priced per incident. Require means-testing for ambulance rides. Introduce competitive providers for 911 dispatch.</w:t>
+      </w:r>
+    </w:p>
+    <w:p>
+      <w:pPr>
+        <w:pStyle w:val="BodyText"/>
+      </w:pPr>
+      <w:r>
+        <w:t xml:space="preserve">Watch people die in the gaps. The safety commons works because it’s impartial, standardized, and pre-funded. Strip that away—make it respond to price signals like a market—and you’ve destroyed the thing that makes</w:t>
+      </w:r>
+      <w:r>
+        <w:t xml:space="preserve"> </w:t>
+      </w:r>
+      <w:r>
+        <w:t xml:space="preserve">“we will come, whoever you are”</w:t>
+      </w:r>
+      <w:r>
+        <w:t xml:space="preserve"> </w:t>
+      </w:r>
+      <w:r>
+        <w:t xml:space="preserve">possible.</w:t>
+      </w:r>
+    </w:p>
+    <w:p>
+      <w:pPr>
+        <w:pStyle w:val="BodyText"/>
+      </w:pPr>
+      <w:r>
+        <w:t xml:space="preserve">But there’s a subtler version.</w:t>
+      </w:r>
+    </w:p>
+    <w:p>
+      <w:pPr>
+        <w:pStyle w:val="BodyText"/>
+      </w:pPr>
+      <w:r>
+        <w:t xml:space="preserve">Market logic doesn’t have to take over completely to cause damage. Sometimes it just asks the wrong questions.</w:t>
+      </w:r>
+    </w:p>
+    <w:p>
+      <w:pPr>
+        <w:pStyle w:val="BodyText"/>
+      </w:pPr>
+      <w:r>
+        <w:t xml:space="preserve">It asks the safety commons:</w:t>
       </w:r>
       <w:r>
         <w:t xml:space="preserve"> </w:t>
@@ -11531,15 +12240,13 @@
           <w:i/>
           <w:iCs/>
         </w:rPr>
-        <w:t xml:space="preserve">Because we’re sized for disasters, not averages. Because readiness costs more than response. Because human life isn’t optimizable.</w:t>
-      </w:r>
-    </w:p>
-    <w:p>
-      <w:pPr>
-        <w:pStyle w:val="BodyText"/>
-      </w:pPr>
-      <w:r>
-        <w:t xml:space="preserve">It asks friendship:</w:t>
+        <w:t xml:space="preserve">Why are you inefficient? Why do your fire trucks sit idle? Why don’t you right-size for average demand?</w:t>
+      </w:r>
+      <w:r>
+        <w:t xml:space="preserve"> </w:t>
+      </w:r>
+      <w:r>
+        <w:t xml:space="preserve">And the safety commons answers:</w:t>
       </w:r>
       <w:r>
         <w:t xml:space="preserve"> </w:t>
@@ -11549,13 +12256,15 @@
           <w:i/>
           <w:iCs/>
         </w:rPr>
-        <w:t xml:space="preserve">What’s the return on this relationship? What’s the networking value? How does this connection advance my career?</w:t>
-      </w:r>
-      <w:r>
-        <w:t xml:space="preserve"> </w:t>
-      </w:r>
-      <w:r>
-        <w:t xml:space="preserve">And friendship answers:</w:t>
+        <w:t xml:space="preserve">Because we’re sized for disasters, not averages. Because readiness costs more than response. Because human life isn’t optimizable.</w:t>
+      </w:r>
+    </w:p>
+    <w:p>
+      <w:pPr>
+        <w:pStyle w:val="BodyText"/>
+      </w:pPr>
+      <w:r>
+        <w:t xml:space="preserve">It asks friendship:</w:t>
       </w:r>
       <w:r>
         <w:t xml:space="preserve"> </w:t>
@@ -11565,15 +12274,13 @@
           <w:i/>
           <w:iCs/>
         </w:rPr>
-        <w:t xml:space="preserve">That’s not the question I exist to answer. I exist to help you become who you want to be. Not to monetize your becoming.</w:t>
-      </w:r>
-    </w:p>
-    <w:p>
-      <w:pPr>
-        <w:pStyle w:val="BodyText"/>
-      </w:pPr>
-      <w:r>
-        <w:t xml:space="preserve">It asks family:</w:t>
+        <w:t xml:space="preserve">What’s the return on this relationship? What’s the networking value? How does this connection advance my career?</w:t>
+      </w:r>
+      <w:r>
+        <w:t xml:space="preserve"> </w:t>
+      </w:r>
+      <w:r>
+        <w:t xml:space="preserve">And friendship answers:</w:t>
       </w:r>
       <w:r>
         <w:t xml:space="preserve"> </w:t>
@@ -11583,13 +12290,15 @@
           <w:i/>
           <w:iCs/>
         </w:rPr>
-        <w:t xml:space="preserve">Shouldn’t the children contribute? Shouldn’t Grandma pay rent? Shouldn’t we quantify the value everyone brings?</w:t>
-      </w:r>
-      <w:r>
-        <w:t xml:space="preserve"> </w:t>
-      </w:r>
-      <w:r>
-        <w:t xml:space="preserve">And family answers:</w:t>
+        <w:t xml:space="preserve">That’s not the question I exist to answer. I exist to help you become who you want to be. Not to monetize your becoming.</w:t>
+      </w:r>
+    </w:p>
+    <w:p>
+      <w:pPr>
+        <w:pStyle w:val="BodyText"/>
+      </w:pPr>
+      <w:r>
+        <w:t xml:space="preserve">It asks family:</w:t>
       </w:r>
       <w:r>
         <w:t xml:space="preserve"> </w:t>
@@ -11599,15 +12308,13 @@
           <w:i/>
           <w:iCs/>
         </w:rPr>
-        <w:t xml:space="preserve">We’re not a company. We’re a commune. The accounting books are supposed to be uneven. That’s what love looks like.</w:t>
-      </w:r>
-    </w:p>
-    <w:p>
-      <w:pPr>
-        <w:pStyle w:val="BodyText"/>
-      </w:pPr>
-      <w:r>
-        <w:t xml:space="preserve">The engine is powerful. But power without purpose is just force. The ten thousand nails, the surplus, the excess—all of it exists</w:t>
+        <w:t xml:space="preserve">Shouldn’t the children contribute? Shouldn’t Grandma pay rent? Shouldn’t we quantify the value everyone brings?</w:t>
+      </w:r>
+      <w:r>
+        <w:t xml:space="preserve"> </w:t>
+      </w:r>
+      <w:r>
+        <w:t xml:space="preserve">And family answers:</w:t>
       </w:r>
       <w:r>
         <w:t xml:space="preserve"> </w:t>
@@ -11617,57 +12324,103 @@
           <w:i/>
           <w:iCs/>
         </w:rPr>
+        <w:t xml:space="preserve">We’re not a company. We’re a commune. The accounting books are supposed to be uneven. That’s what love looks like.</w:t>
+      </w:r>
+    </w:p>
+    <w:p>
+      <w:pPr>
+        <w:pStyle w:val="BodyText"/>
+      </w:pPr>
+      <w:r>
+        <w:t xml:space="preserve">The engine is powerful.</w:t>
+      </w:r>
+    </w:p>
+    <w:p>
+      <w:pPr>
+        <w:pStyle w:val="BodyText"/>
+      </w:pPr>
+      <w:r>
+        <w:t xml:space="preserve">But power without purpose is just force.</w:t>
+      </w:r>
+    </w:p>
+    <w:p>
+      <w:pPr>
+        <w:pStyle w:val="BodyText"/>
+      </w:pPr>
+      <w:r>
+        <w:t xml:space="preserve">The ten thousand nails, the surplus, the excess; all of it exists</w:t>
+      </w:r>
+      <w:r>
+        <w:t xml:space="preserve"> </w:t>
+      </w:r>
+      <w:r>
+        <w:rPr>
+          <w:i/>
+          <w:iCs/>
+        </w:rPr>
         <w:t xml:space="preserve">for</w:t>
       </w:r>
       <w:r>
         <w:t xml:space="preserve"> </w:t>
       </w:r>
       <w:r>
-        <w:t xml:space="preserve">something. It exists to fund the fire truck so families can sleep safely. It exists to create the specialized skills that make voluntary help valuable. It exists to build the abundance that makes sustainable generosity possible.</w:t>
-      </w:r>
-    </w:p>
-    <w:p>
-      <w:pPr>
-        <w:pStyle w:val="BodyText"/>
-      </w:pPr>
-      <w:r>
-        <w:t xml:space="preserve">If the market becomes its own purpose—if surplus-seeking becomes the goal instead of the means—then the engine eats the house. The nail-maker who treats her employees as tools, her customers as marks, her competitors as enemies, and her family as a cost center has forgotten what the nails were for.</w:t>
-      </w:r>
-    </w:p>
-    <w:p>
-      <w:pPr>
-        <w:pStyle w:val="BodyText"/>
-      </w:pPr>
-      <w:r>
-        <w:t xml:space="preserve">They were for building homes where people can love each other.</w:t>
-      </w:r>
-      <w:r>
-        <w:t xml:space="preserve"> </w:t>
-      </w:r>
-      <w:r>
-        <w:t xml:space="preserve">They were for funding the safety that protects the vulnerable.</w:t>
-      </w:r>
-      <w:r>
-        <w:t xml:space="preserve"> </w:t>
-      </w:r>
-      <w:r>
-        <w:t xml:space="preserve">They were for creating the abundance that friendship can deploy.</w:t>
-      </w:r>
-    </w:p>
-    <w:p>
-      <w:pPr>
-        <w:pStyle w:val="BodyText"/>
-      </w:pPr>
-      <w:r>
-        <w:t xml:space="preserve">The surplus engine is glorious. But it’s an engine. Not a destination.</w:t>
-      </w:r>
-    </w:p>
-    <w:p>
-      <w:pPr>
-        <w:pStyle w:val="BodyText"/>
-      </w:pPr>
-      <w:r>
-        <w:t xml:space="preserve">It must be put to the use of love and protection in the other habitats—or it will ruin them.</w:t>
+        <w:t xml:space="preserve">something. Surplus exists to fund the fire truck so families can sleep safely.</w:t>
+      </w:r>
+    </w:p>
+    <w:p>
+      <w:pPr>
+        <w:pStyle w:val="BodyText"/>
+      </w:pPr>
+      <w:r>
+        <w:t xml:space="preserve">It exists to create the specialized skills that make voluntary help valuable. It exists to build the abundance that makes sustainable generosity possible.</w:t>
+      </w:r>
+    </w:p>
+    <w:p>
+      <w:pPr>
+        <w:pStyle w:val="BodyText"/>
+      </w:pPr>
+      <w:r>
+        <w:t xml:space="preserve">If the market becomes its own purpose, if surplus-seeking becomes the goal instead of the means, then the engine eats the house.</w:t>
+      </w:r>
+    </w:p>
+    <w:p>
+      <w:pPr>
+        <w:pStyle w:val="BodyText"/>
+      </w:pPr>
+      <w:r>
+        <w:t xml:space="preserve">The nail-maker who treats her employees as tools, her customers as milestones, her competitors as obstacles, and her family as a cost center has forgotten what the nails were for.</w:t>
+      </w:r>
+    </w:p>
+    <w:p>
+      <w:pPr>
+        <w:pStyle w:val="BodyText"/>
+      </w:pPr>
+      <w:r>
+        <w:t xml:space="preserve">They were for building homes where people can love each other. They were for funding the advancement and growth in specialization. They were for creating the liberty of abundance that friendship can deploy.</w:t>
+      </w:r>
+    </w:p>
+    <w:p>
+      <w:pPr>
+        <w:pStyle w:val="BodyText"/>
+      </w:pPr>
+      <w:r>
+        <w:t xml:space="preserve">The market engine is glorious. But it’s an engine. Not a destination.</w:t>
+      </w:r>
+    </w:p>
+    <w:p>
+      <w:pPr>
+        <w:pStyle w:val="BodyText"/>
+      </w:pPr>
+      <w:r>
+        <w:t xml:space="preserve">It must be put to the use of love and protection in the other habitats, or it will ruin them.</w:t>
+      </w:r>
+    </w:p>
+    <w:p>
+      <w:pPr>
+        <w:pStyle w:val="BodyText"/>
+      </w:pPr>
+      <w:r>
+        <w:t xml:space="preserve">Power for the sake of power cannot have meaning.</w:t>
       </w:r>
     </w:p>
     <w:bookmarkEnd w:id="98"/>
@@ -11710,15 +12463,39 @@
         <w:pStyle w:val="BodyText"/>
       </w:pPr>
       <w:r>
-        <w:t xml:space="preserve">Within days, he’s lost his capacity for coherent thought. He’ll spend the next eleven years in mental twilight, never recovering, the most powerful thinker of his age broken by witnessing pure instrumentality. Power without purpose. Force without meaning. A creature reduced to a tool and beaten when it failed to perform.</w:t>
-      </w:r>
-    </w:p>
-    <w:p>
-      <w:pPr>
-        <w:pStyle w:val="BodyText"/>
-      </w:pPr>
-      <w:r>
-        <w:t xml:space="preserve">This is what happens when the engine becomes the only thing. When market logic escapes its habitat and invades everything. When price replaces purpose. When everything becomes a resource to be optimized, everyone becomes a tool to be used, and the question</w:t>
+        <w:t xml:space="preserve">Within days, he’s lost his capacity for coherent thought. He’ll spend the next eleven years in mental twilight, never recovering, the most powerful thinker of his age broken by witnessing pure instrumentality.</w:t>
+      </w:r>
+    </w:p>
+    <w:p>
+      <w:pPr>
+        <w:pStyle w:val="BodyText"/>
+      </w:pPr>
+      <w:r>
+        <w:t xml:space="preserve">Power without purpose. Force without meaning. A creature reduced to a tool and beaten when it failed to perform.</w:t>
+      </w:r>
+    </w:p>
+    <w:p>
+      <w:pPr>
+        <w:pStyle w:val="BodyText"/>
+      </w:pPr>
+      <w:r>
+        <w:t xml:space="preserve">Whether allegory or real story, this captures the idea.</w:t>
+      </w:r>
+    </w:p>
+    <w:p>
+      <w:pPr>
+        <w:pStyle w:val="BodyText"/>
+      </w:pPr>
+      <w:r>
+        <w:t xml:space="preserve">This is what happens when the engine becomes the only thing. When market logic escapes its habitat and invades everything. When price replaces purpose.</w:t>
+      </w:r>
+    </w:p>
+    <w:p>
+      <w:pPr>
+        <w:pStyle w:val="BodyText"/>
+      </w:pPr>
+      <w:r>
+        <w:t xml:space="preserve">When everything becomes a resource to be optimized, everyone becomes a tool to be used, and the question</w:t>
       </w:r>
       <w:r>
         <w:t xml:space="preserve"> </w:t>
@@ -11738,7 +12515,23 @@
         <w:pStyle w:val="BodyText"/>
       </w:pPr>
       <w:r>
-        <w:t xml:space="preserve">Markets are power. Incredible power. The power to generate surplus, to coordinate millions, to lift billions from poverty, to create abundance that would’ve looked like magic to anyone living two hundred years ago. That power is real. That power matters. That power is beautiful.</w:t>
+        <w:t xml:space="preserve">Markets are power. Incredible power.</w:t>
+      </w:r>
+    </w:p>
+    <w:p>
+      <w:pPr>
+        <w:pStyle w:val="BodyText"/>
+      </w:pPr>
+      <w:r>
+        <w:t xml:space="preserve">The power to generate surplus, to coordinate millions, to lift billions from poverty, to create abundance that would’ve looked like magic to anyone living two hundred years ago.</w:t>
+      </w:r>
+    </w:p>
+    <w:p>
+      <w:pPr>
+        <w:pStyle w:val="BodyText"/>
+      </w:pPr>
+      <w:r>
+        <w:t xml:space="preserve">That power is real. That power matters. That power is beautiful.</w:t>
       </w:r>
     </w:p>
     <w:p>
@@ -11792,15 +12585,55 @@
         <w:pStyle w:val="BodyText"/>
       </w:pPr>
       <w:r>
-        <w:t xml:space="preserve">The nail-maker makes ten thousand nails. That’s power. But if her employees, customers, and her competitors are nothing more than tools and obstacles, she’s the coachman. If she uses that power to generate abundant value joining a million other specialists in creating a civilization of wonderful technology, rich with humanity, that power underwrites family and safety and friendship and flourishing, she’s serving something larger than the engine.</w:t>
-      </w:r>
-    </w:p>
-    <w:p>
-      <w:pPr>
-        <w:pStyle w:val="BodyText"/>
-      </w:pPr>
-      <w:r>
-        <w:t xml:space="preserve">Markets are one of the habitats. We need to use their logic when we are operating in a market habitat. But when we apply their logic to friendships or family, you get relationships transactionalized. When we apply their logic to safety commons, you get emergencies exploited.</w:t>
+        <w:t xml:space="preserve">The nail-maker makes ten thousand nails.</w:t>
+      </w:r>
+    </w:p>
+    <w:p>
+      <w:pPr>
+        <w:pStyle w:val="BodyText"/>
+      </w:pPr>
+      <w:r>
+        <w:t xml:space="preserve">That’s power.</w:t>
+      </w:r>
+    </w:p>
+    <w:p>
+      <w:pPr>
+        <w:pStyle w:val="BodyText"/>
+      </w:pPr>
+      <w:r>
+        <w:t xml:space="preserve">But if her employees, customers, and her competitors are nothing more than tools and obstacles, she’s the coachman.</w:t>
+      </w:r>
+    </w:p>
+    <w:p>
+      <w:pPr>
+        <w:pStyle w:val="BodyText"/>
+      </w:pPr>
+      <w:r>
+        <w:t xml:space="preserve">If she uses that power to generate abundant value joining a million other specialists in creating a civilization of wonderful technology, rich with humanity, that power underwrites family and safety and friendship and flourishing, she’s serving something larger than the engine.</w:t>
+      </w:r>
+    </w:p>
+    <w:p>
+      <w:pPr>
+        <w:pStyle w:val="BodyText"/>
+      </w:pPr>
+      <w:r>
+        <w:t xml:space="preserve">Markets are one of the habitats.</w:t>
+      </w:r>
+    </w:p>
+    <w:p>
+      <w:pPr>
+        <w:pStyle w:val="BodyText"/>
+      </w:pPr>
+      <w:r>
+        <w:t xml:space="preserve">We need to use their logic when we are operating in a market habitat. But when we apply their logic to friendships or family, you get relationships transactionalized.</w:t>
+      </w:r>
+    </w:p>
+    <w:p>
+      <w:pPr>
+        <w:pStyle w:val="BodyText"/>
+      </w:pPr>
+      <w:r>
+        <w:t xml:space="preserve">When we apply their logic to safety commons, you get emergencies exploited.</w:t>
       </w:r>
     </w:p>
     <w:p>
@@ -11844,7 +12677,15 @@
         <w:t xml:space="preserve"> </w:t>
       </w:r>
       <w:r>
-        <w:t xml:space="preserve">What you sell to make ends meet. The source you owe to yourself and your dependents just to keep the system running. The floor. The baseline. No guilt here. No obligation beyond survival.</w:t>
+        <w:t xml:space="preserve">What you sell to make ends meet. The source you owe to yourself and your dependents just to keep the system running. The floor. The baseline.</w:t>
+      </w:r>
+    </w:p>
+    <w:p>
+      <w:pPr>
+        <w:pStyle w:val="BodyText"/>
+      </w:pPr>
+      <w:r>
+        <w:t xml:space="preserve">No guilt here. No obligation beyond survival.</w:t>
       </w:r>
     </w:p>
     <w:p>
@@ -11862,7 +12703,15 @@
         <w:t xml:space="preserve"> </w:t>
       </w:r>
       <w:r>
-        <w:t xml:space="preserve">Rent or mortgage. Food. Utilities. Basic transportation. Maybe healthcare. Maybe childcare if you have kids and need to work. Laundry. Car. These aren’t choices. These are requirements. You produce a certain level of value to pay for these needs.</w:t>
+        <w:t xml:space="preserve">Rent or mortgage. Food. Utilities. Basic transportation. Maybe healthcare. Maybe childcare if you have kids and need to work. Laundry. Car.</w:t>
+      </w:r>
+    </w:p>
+    <w:p>
+      <w:pPr>
+        <w:pStyle w:val="BodyText"/>
+      </w:pPr>
+      <w:r>
+        <w:t xml:space="preserve">These aren’t choices. These are requirements. You produce a certain level of value to pay for these needs.</w:t>
       </w:r>
     </w:p>
     <w:p>
@@ -11880,7 +12729,15 @@
         <w:t xml:space="preserve"> </w:t>
       </w:r>
       <w:r>
-        <w:t xml:space="preserve">The growth. The investments. The advanced degree. Marketing. Conferences. Professional organizations. New tooling. Advanced certifications. The value you produce that you then pour back into what makes you better, more effective at your work and profession.</w:t>
+        <w:t xml:space="preserve">The growth. The investments. The advanced degree. Marketing. Conferences. Professional organizations. New tooling. Advanced certifications.</w:t>
+      </w:r>
+    </w:p>
+    <w:p>
+      <w:pPr>
+        <w:pStyle w:val="BodyText"/>
+      </w:pPr>
+      <w:r>
+        <w:t xml:space="preserve">The value you produce that you then pour back into what makes you better, more effective at your work and profession.</w:t>
       </w:r>
     </w:p>
     <w:p>
@@ -11916,7 +12773,23 @@
         <w:t xml:space="preserve"> </w:t>
       </w:r>
       <w:r>
-        <w:t xml:space="preserve">The resources that remain after survival and growth. The genuinely discretionary value you can produce above and beyond what your market will exchange for. The liberty pile. The place where obligation lives because choice lives. The thousand nails that create possibility.</w:t>
+        <w:t xml:space="preserve">The resources that remain after survival and growth. The genuinely discretionary value you can produce above and beyond what your market will exchange for.</w:t>
+      </w:r>
+    </w:p>
+    <w:p>
+      <w:pPr>
+        <w:pStyle w:val="BodyText"/>
+      </w:pPr>
+      <w:r>
+        <w:t xml:space="preserve">The liberty pile.</w:t>
+      </w:r>
+    </w:p>
+    <w:p>
+      <w:pPr>
+        <w:pStyle w:val="BodyText"/>
+      </w:pPr>
+      <w:r>
+        <w:t xml:space="preserve">The place where obligation lives because choice lives. The thousand nails that create possibility.</w:t>
       </w:r>
     </w:p>
     <w:p>

</xml_diff>

<commit_message>
Ch6 Phase 2 COMPLETE: Voice polish (remove 'And' openings, tighten transitions, strengthen Discernment markers)
</commit_message>
<xml_diff>
--- a/manuscript/COMPLETE-MANUSCRIPT-FOR-REVIEW.docx
+++ b/manuscript/COMPLETE-MANUSCRIPT-FOR-REVIEW.docx
@@ -13003,15 +13003,15 @@
         <w:pStyle w:val="BodyText"/>
       </w:pPr>
       <w:r>
-        <w:t xml:space="preserve">Notice something else: nobody burned their last loaf of bread. Nobody sacrificed their rent money or called in sick to work when they couldn’t afford it. The guy with the truck had a truck he wasn’t using that Saturday. The person who watched kids had time because her own kids were with their grandparents this weekend. The pizza-runner had $40 he didn’t need for anything else. Everyone who showed up had something to give: time, energy, capacity beyond their own immediate needs.</w:t>
-      </w:r>
-    </w:p>
-    <w:p>
-      <w:pPr>
-        <w:pStyle w:val="BodyText"/>
-      </w:pPr>
-      <w:r>
-        <w:t xml:space="preserve">Here’s something worth noticing about that capacity. It often comes from excess. From having just a little more than you strictly need. The friend who drives a semi-truck professionally brought packing skills developed in the market, deployed here as a friend. That’s a pattern we’ll return to in Chapter 9. But for now, let’s understand what actually makes friendship work as a system.</w:t>
+        <w:t xml:space="preserve">Notice something else about moving day: nobody burned their last loaf of bread. Nobody sacrificed their rent money or called in sick to work when they couldn’t afford it. The guy with the truck had a truck he wasn’t using that Saturday. The person who watched kids had time because her own kids were with their grandparents this weekend. The pizza-runner had $40 he didn’t need for anything else. Everyone who showed up had something to give: time, energy, capacity beyond their own immediate needs.</w:t>
+      </w:r>
+    </w:p>
+    <w:p>
+      <w:pPr>
+        <w:pStyle w:val="BodyText"/>
+      </w:pPr>
+      <w:r>
+        <w:t xml:space="preserve">That capacity often comes from excess, from having just a little more than you strictly need. The friend who drives a semi-truck professionally brought packing skills developed in the market, deployed here as a friend. That’s a pattern we’ll return to in Chapter 9. But for now, let’s understand what actually makes friendship work as a system.</w:t>
       </w:r>
     </w:p>
     <w:p>
@@ -13180,15 +13180,15 @@
         <w:pStyle w:val="BodyText"/>
       </w:pPr>
       <w:r>
-        <w:t xml:space="preserve">And trust works at this scale, chosen networks, people you know, relationships you’ve built, in a way that it can’t work with strangers or at population scale. You can’t trust everyone. You shouldn’t trust everyone. But you can trust specific people based on specific history. And those specific trust relationships create networks where helping each other is the default, where asking for help isn’t weakness, where showing up is just what you do.</w:t>
-      </w:r>
-    </w:p>
-    <w:p>
-      <w:pPr>
-        <w:pStyle w:val="BodyText"/>
-      </w:pPr>
-      <w:r>
-        <w:t xml:space="preserve">This is why moving day works: not because anyone has authority, but because everyone trusts everyone else enough to show up, to do their part, to not take advantage. Trust governs without force.</w:t>
+        <w:t xml:space="preserve">Trust works at this scale, chosen networks, people you know, relationships you’ve built, in ways it can’t work with strangers or at population scale. You can’t trust everyone. You shouldn’t trust everyone. But you can trust specific people based on specific history. Those specific trust relationships create networks where helping each other is the default, where asking for help isn’t weakness, where showing up is just what you do.</w:t>
+      </w:r>
+    </w:p>
+    <w:p>
+      <w:pPr>
+        <w:pStyle w:val="BodyText"/>
+      </w:pPr>
+      <w:r>
+        <w:t xml:space="preserve">This is why moving day works. Not because anyone has authority, but because everyone trusts everyone else enough to show up, to do their part, to not take advantage. Trust governs without force.</w:t>
       </w:r>
     </w:p>
     <w:bookmarkEnd w:id="103"/>
@@ -13242,7 +13242,7 @@
         <w:pStyle w:val="BodyText"/>
       </w:pPr>
       <w:r>
-        <w:t xml:space="preserve">And that’s enough. Because voluntary networks don’t have captive members. They have chosen members. And if your reputation degrades, if people stop trusting you and stop wanting you around, you lose access to the network. Not through exile. Not through banishment. Just through… people making different choices about who to invite, who to call, who to trust.</w:t>
+        <w:t xml:space="preserve">And that’s enough. Voluntary networks don’t have captive members. They have chosen members. If your reputation degrades, if people stop trusting you and stop wanting you around, you lose access to the network. Not through exile. Not through banishment. Just through people making different choices about who to invite, who to call, who to trust.</w:t>
       </w:r>
     </w:p>
     <w:p>
@@ -13419,7 +13419,7 @@
         <w:pStyle w:val="BodyText"/>
       </w:pPr>
       <w:r>
-        <w:t xml:space="preserve">And here’s something that doesn’t get said enough: friendship is where you become yourself. Not the self your family expects. Not the self your job requires. Not the self the market wants. The self you discover through voluntary connection with people who see you and choose you anyway.</w:t>
+        <w:t xml:space="preserve">Here’s something that doesn’t get said enough: friendship is where you become yourself. Not the self your family expects. Not the self your job requires. Not the self the market wants. The self you discover through voluntary connection with people who see you and choose you anyway.</w:t>
       </w:r>
     </w:p>
     <w:p>
@@ -13443,7 +13443,7 @@
         <w:pStyle w:val="BodyText"/>
       </w:pPr>
       <w:r>
-        <w:t xml:space="preserve">And it only works because it’s voluntary. Because if it were forced, if you had to be friends with specific people, if you couldn’t leave relationships that didn’t work, it would be prison, not friendship. The choice is the whole point. The exit option is what makes the whole thing safe enough to be transformative.</w:t>
+        <w:t xml:space="preserve">It only works because it’s voluntary. If it were forced, if you had to be friends with specific people, if you couldn’t leave relationships that didn’t work, it would be prison, not friendship. The choice is the whole point. The exit option is what makes the whole thing safe enough to be transformative.</w:t>
       </w:r>
     </w:p>
     <w:p>
@@ -13481,15 +13481,15 @@
         <w:pStyle w:val="FirstParagraph"/>
       </w:pPr>
       <w:r>
-        <w:t xml:space="preserve">Here’s something that becomes visible once you start looking: one of the things that flows through friendship networks is excess capacity.</w:t>
-      </w:r>
-    </w:p>
-    <w:p>
-      <w:pPr>
-        <w:pStyle w:val="BodyText"/>
-      </w:pPr>
-      <w:r>
-        <w:t xml:space="preserve">Remember the moving day? Everyone who showed up had something to give. But notice what they gave: not their last dollar, not their only Saturday of the year, not the time they needed for survival. They gave from abundance. From the extra truck-capacity on a Saturday morning. From the free hours after their own priorities were covered. From the pizza budget that didn’t cut into groceries.</w:t>
+        <w:t xml:space="preserve">Something becomes visible once you start looking: one of the things that flows through friendship networks is excess capacity.</w:t>
+      </w:r>
+    </w:p>
+    <w:p>
+      <w:pPr>
+        <w:pStyle w:val="BodyText"/>
+      </w:pPr>
+      <w:r>
+        <w:t xml:space="preserve">Remember moving day? Everyone who showed up had something to give. But notice what they gave: not their last dollar, not their only Saturday of the year, not the time they needed for survival. They gave from abundance. From the extra truck-capacity on a Saturday morning. From the free hours after their own priorities were covered. From the pizza budget that didn’t cut into groceries.</w:t>
       </w:r>
     </w:p>
     <w:p>
@@ -13525,7 +13525,7 @@
         <w:pStyle w:val="BodyText"/>
       </w:pPr>
       <w:r>
-        <w:t xml:space="preserve">And one place that excess can flow is through friendship networks.</w:t>
+        <w:t xml:space="preserve">One place that excess can flow is through friendship networks.</w:t>
       </w:r>
     </w:p>
     <w:p>
@@ -13567,15 +13567,15 @@
         <w:pStyle w:val="BodyText"/>
       </w:pPr>
       <w:r>
-        <w:t xml:space="preserve">This is why friendship doesn’t burn out the way obligated giving does. This is why helping friends feels energizing while being extracted from feels depleting. But notice: this is a description of what CAN flow through friendship, not what DEFINES it. Friendship is defined by trust, reputation, and exit. Excess is one of many things that flows through those networks.</w:t>
-      </w:r>
-    </w:p>
-    <w:p>
-      <w:pPr>
-        <w:pStyle w:val="BodyText"/>
-      </w:pPr>
-      <w:r>
-        <w:t xml:space="preserve">We’ll return to this in Chapter 9, where we explore the obligation that comes with excess. But for now, notice it as a thread: the people on moving day weren’t saints sacrificing their survival. They were friends with something extra, putting it where it belonged.</w:t>
+        <w:t xml:space="preserve">This is why friendship doesn’t burn out the way obligated giving does. Why helping friends feels energizing while being extracted from feels depleting. But notice: this is what CAN flow through friendship, not what DEFINES it. Friendship is defined by trust, reputation, and exit. Excess is one of many things that flows through those networks.</w:t>
+      </w:r>
+    </w:p>
+    <w:p>
+      <w:pPr>
+        <w:pStyle w:val="BodyText"/>
+      </w:pPr>
+      <w:r>
+        <w:t xml:space="preserve">We’ll return to this in Chapter 9, where we explore the obligation that comes with excess. For now, notice it as a thread: the people on moving day weren’t saints sacrificing their survival. They were friends with something extra, putting it where it belonged.</w:t>
       </w:r>
     </w:p>
     <w:bookmarkEnd w:id="108"/>
@@ -13601,7 +13601,7 @@
         <w:pStyle w:val="BodyText"/>
       </w:pPr>
       <w:r>
-        <w:t xml:space="preserve">And when it worked, it worked because people showed up voluntarily. Because they chose to contribute. Because they cared about the mission enough to give their time. And when it didn’t work, it was often because people stopped choosing to participate. Because they exercised their exit option. Because voluntary networks can’t force continued participation—they can only make participation worth it.</w:t>
+        <w:t xml:space="preserve">When it worked, it worked because people showed up voluntarily. Because they chose to contribute. Because they cared about the mission enough to give their time. When it didn’t work, it was often because people stopped choosing to participate. Because they exercised their exit option. Because voluntary networks can’t force continued participation—they can only make participation worth it.</w:t>
       </w:r>
     </w:p>
     <w:bookmarkEnd w:id="109"/>
@@ -13695,7 +13695,7 @@
         <w:pStyle w:val="BodyText"/>
       </w:pPr>
       <w:r>
-        <w:t xml:space="preserve">And when these communities work, they work through the same mechanisms: trust that people will show up and contribute, reputation that governs behavior, exit that disciplines the whole system by ensuring that if it stops working, people will leave.</w:t>
+        <w:t xml:space="preserve">When these communities work, they work through the same mechanisms: trust that people will show up and contribute, reputation that governs behavior, exit that disciplines the whole system by ensuring that if it stops working, people will leave.</w:t>
       </w:r>
     </w:p>
     <w:p>
@@ -13729,7 +13729,7 @@
         <w:pStyle w:val="BodyText"/>
       </w:pPr>
       <w:r>
-        <w:t xml:space="preserve">But it’s not dangerous. It’s ordinary. It’s just coordination without command. It’s just people choosing to cooperate because cooperation makes sense, because relationships matter, because community is valuable.</w:t>
+        <w:t xml:space="preserve">But it’s not dangerous. It’s ordinary. It’s coordination without command. It’s people choosing to cooperate because cooperation makes sense, because relationships matter, because community is valuable.</w:t>
       </w:r>
     </w:p>
     <w:p>
@@ -14357,7 +14357,7 @@
         <w:pStyle w:val="BodyText"/>
       </w:pPr>
       <w:r>
-        <w:t xml:space="preserve">And tonight you’ll text a friend about dinner. Or scroll through a community you chose. Or volunteer for something you care about. Or coordinate something with people who could leave but choose to stay. That’s anarchy, at friendship scale, working exactly as it should.</w:t>
+        <w:t xml:space="preserve">Tonight you’ll text a friend about dinner. Or scroll through a community you chose. Or volunteer for something you care about. Or coordinate something with people who could leave but choose to stay. That’s anarchy, at friendship scale, working exactly as it should.</w:t>
       </w:r>
     </w:p>
     <w:p>
@@ -14383,7 +14383,7 @@
         <w:pStyle w:val="BodyText"/>
       </w:pPr>
       <w:r>
-        <w:t xml:space="preserve">And here’s one more layer:</w:t>
+        <w:t xml:space="preserve">Here’s one more layer:</w:t>
       </w:r>
       <w:r>
         <w:t xml:space="preserve"> </w:t>
@@ -14425,7 +14425,7 @@
         <w:pStyle w:val="BodyText"/>
       </w:pPr>
       <w:r>
-        <w:t xml:space="preserve">And in friendship? You chose to show up. You trusted and were trusted back. And often, what you gave came from excess, from capacity beyond your immediate needs. But that’s not what made it friendship. What made it friendship was the choosing. The voluntary coordination. The trust that let you show up without a contract.</w:t>
+        <w:t xml:space="preserve">In friendship? You chose to show up. You trusted and were trusted back. Often, what you gave came from excess, from capacity beyond your immediate needs. But that’s not what made it friendship. What made it friendship was the choosing. The voluntary coordination. The trust that let you show up without a contract.</w:t>
       </w:r>
     </w:p>
     <w:p>
@@ -14498,7 +14498,7 @@
         <w:pStyle w:val="BodyText"/>
       </w:pPr>
       <w:r>
-        <w:t xml:space="preserve">And you’re going to notice something else: the flow between them. Markets generate the surplus that becomes excess. That excess can flow through friendship networks, among other places. Friendship backstops the safety systems. Safety protects the families. Families raise the workers who participate in markets. The Ring isn’t just four separate systems. It’s four systems that feed each other, that depend on each other, that complete each other.</w:t>
+        <w:t xml:space="preserve">You’re going to notice something else: the flow between them. Markets generate the surplus that becomes excess. That excess can flow through friendship networks, among other places. Friendship backstops the safety systems. Safety protects the families. Families raise the workers who participate in markets. The Ring isn’t just four separate systems. It’s four systems that feed each other, that depend on each other, that complete each other.</w:t>
       </w:r>
     </w:p>
     <w:p>
@@ -14522,7 +14522,7 @@
         <w:pStyle w:val="BodyText"/>
       </w:pPr>
       <w:r>
-        <w:t xml:space="preserve">And now that you have the map, now that you can see all four habitats, we can move to the hard part: what happens when they touch?</w:t>
+        <w:t xml:space="preserve">Now that you have the map, now that you can see all four habitats, we can move to the hard part: what happens when they touch?</w:t>
       </w:r>
     </w:p>
     <w:p>

</xml_diff>